<commit_message>
Completed three plate method picture
</commit_message>
<xml_diff>
--- a/Electrical/Level 3 - 2365/6 - Lesson/Writeups/ThreePlateMethod/ThreePlateMethod.docx
+++ b/Electrical/Level 3 - 2365/6 - Lesson/Writeups/ThreePlateMethod/ThreePlateMethod.docx
@@ -1,6 +1,7 @@
 
 <file path=word/document.xml><?xml version="1.0" encoding="utf-8"?>
 <w:document xmlns:mc="http://schemas.openxmlformats.org/markup-compatibility/2006" xmlns:o="urn:schemas-microsoft-com:office:office" xmlns:r="http://schemas.openxmlformats.org/officeDocument/2006/relationships" xmlns:m="http://schemas.openxmlformats.org/officeDocument/2006/math" xmlns:v="urn:schemas-microsoft-com:vml" xmlns:wp="http://schemas.openxmlformats.org/drawingml/2006/wordprocessingDrawing" xmlns:w10="urn:schemas-microsoft-com:office:word" xmlns:w="http://schemas.openxmlformats.org/wordprocessingml/2006/main" xmlns:wne="http://schemas.microsoft.com/office/word/2006/wordml" xmlns:sl="http://schemas.openxmlformats.org/schemaLibrary/2006/main" xmlns:a="http://schemas.openxmlformats.org/drawingml/2006/main" xmlns:pic="http://schemas.openxmlformats.org/drawingml/2006/picture" xmlns:c="http://schemas.openxmlformats.org/drawingml/2006/chart" xmlns:lc="http://schemas.openxmlformats.org/drawingml/2006/lockedCanvas" xmlns:dgm="http://schemas.openxmlformats.org/drawingml/2006/diagram" xmlns:wps="http://schemas.microsoft.com/office/word/2010/wordprocessingShape" xmlns:wpg="http://schemas.microsoft.com/office/word/2010/wordprocessingGroup" xmlns:w14="http://schemas.microsoft.com/office/word/2010/wordml" xmlns:w15="http://schemas.microsoft.com/office/word/2012/wordml" xmlns:w16="http://schemas.microsoft.com/office/word/2018/wordml" xmlns:w16cex="http://schemas.microsoft.com/office/word/2018/wordml/cex" xmlns:w16cid="http://schemas.microsoft.com/office/word/2016/wordml/cid" xmlns="http://schemas.microsoft.com/office/tasks/2019/documenttasks" xmlns:cr="http://schemas.microsoft.com/office/comments/2020/reactions">
+  <w:background w:color="FFD966"/>
   <w:body>
     <w:p>
       <w:pPr>
@@ -12,12 +13,12 @@
           <wp:inline distB="114300" distT="114300" distL="114300" distR="114300">
             <wp:extent cx="8367713" cy="5141706"/>
             <wp:effectExtent b="50800" l="50800" r="50800" t="50800"/>
-            <wp:docPr id="1" name="image1.png"/>
+            <wp:docPr id="2" name="image2.png"/>
             <a:graphic>
               <a:graphicData uri="http://schemas.openxmlformats.org/drawingml/2006/picture">
                 <pic:pic>
                   <pic:nvPicPr>
-                    <pic:cNvPr id="0" name="image1.png"/>
+                    <pic:cNvPr id="0" name="image2.png"/>
                     <pic:cNvPicPr preferRelativeResize="0"/>
                   </pic:nvPicPr>
                   <pic:blipFill>
@@ -82,12 +83,12 @@
           <wp:inline distB="114300" distT="114300" distL="114300" distR="114300">
             <wp:extent cx="7933332" cy="6338888"/>
             <wp:effectExtent b="50800" l="50800" r="50800" t="50800"/>
-            <wp:docPr id="2" name="image2.png"/>
+            <wp:docPr id="3" name="image3.png"/>
             <a:graphic>
               <a:graphicData uri="http://schemas.openxmlformats.org/drawingml/2006/picture">
                 <pic:pic>
                   <pic:nvPicPr>
-                    <pic:cNvPr id="0" name="image2.png"/>
+                    <pic:cNvPr id="0" name="image3.png"/>
                     <pic:cNvPicPr preferRelativeResize="0"/>
                   </pic:nvPicPr>
                   <pic:blipFill>
@@ -134,16 +135,6 @@
     </w:p>
     <w:p>
       <w:pPr>
-        <w:rPr/>
-      </w:pPr>
-      <w:r>
-        <w:rPr>
-          <w:rtl w:val="0"/>
-        </w:rPr>
-      </w:r>
-    </w:p>
-    <w:p>
-      <w:pPr>
         <w:rPr>
           <w:b w:val="1"/>
           <w:bCs w:val="1"/>
@@ -904,33 +895,249 @@
           <w:bCs w:val="1"/>
           <w:rtl w:val="0"/>
         </w:rPr>
-        <w:t xml:space="preserve"> .</w:t>
-        <w:br w:type="textWrapping"/>
-      </w:r>
-      <w:r>
-        <w:rPr>
-          <w:rtl w:val="0"/>
-        </w:rPr>
-      </w:r>
-    </w:p>
-    <w:p>
-      <w:pPr>
-        <w:rPr>
-          <w:b w:val="1"/>
-          <w:bCs w:val="1"/>
-          <w:u w:val="single"/>
-        </w:rPr>
-      </w:pPr>
-      <w:r>
-        <w:rPr>
-          <w:rtl w:val="0"/>
-        </w:rPr>
+        <w:t xml:space="preserve">.</w:t>
+      </w:r>
+    </w:p>
+    <w:p>
+      <w:pPr>
+        <w:rPr>
+          <w:b w:val="1"/>
+          <w:bCs w:val="1"/>
+        </w:rPr>
+      </w:pPr>
+      <w:r>
+        <w:rPr>
+          <w:rtl w:val="0"/>
+        </w:rPr>
+      </w:r>
+    </w:p>
+    <w:p>
+      <w:pPr>
+        <w:rPr>
+          <w:b w:val="1"/>
+          <w:bCs w:val="1"/>
+        </w:rPr>
+      </w:pPr>
+      <w:r>
+        <w:rPr>
+          <w:rtl w:val="0"/>
+        </w:rPr>
+      </w:r>
+    </w:p>
+    <w:p>
+      <w:pPr>
+        <w:rPr>
+          <w:b w:val="1"/>
+          <w:bCs w:val="1"/>
+          <w:sz w:val="26"/>
+          <w:szCs w:val="26"/>
+          <w:u w:val="single"/>
+        </w:rPr>
+      </w:pPr>
+      <w:r>
+        <w:rPr>
+          <w:b w:val="1"/>
+          <w:bCs w:val="1"/>
+          <w:sz w:val="26"/>
+          <w:szCs w:val="26"/>
+          <w:u w:val="single"/>
+          <w:rtl w:val="0"/>
+        </w:rPr>
+        <w:t xml:space="preserve">Notes </w:t>
+      </w:r>
+    </w:p>
+    <w:p>
+      <w:pPr>
+        <w:rPr>
+          <w:b w:val="1"/>
+          <w:bCs w:val="1"/>
+        </w:rPr>
+      </w:pPr>
+      <w:r>
+        <w:rPr>
+          <w:rtl w:val="0"/>
+        </w:rPr>
+      </w:r>
+    </w:p>
+    <w:p>
+      <w:pPr>
+        <w:rPr>
+          <w:b w:val="1"/>
+          <w:bCs w:val="1"/>
+        </w:rPr>
+      </w:pPr>
+      <w:r>
+        <w:rPr>
+          <w:b w:val="1"/>
+          <w:bCs w:val="1"/>
+          <w:rtl w:val="0"/>
+        </w:rPr>
+        <w:t xml:space="preserve">The wires colours are not mandatory rather preferential. Because, the wires are all live so they should be brown. </w:t>
+      </w:r>
+    </w:p>
+    <w:p>
+      <w:pPr>
+        <w:rPr>
+          <w:b w:val="1"/>
+          <w:bCs w:val="1"/>
+        </w:rPr>
+      </w:pPr>
+      <w:r>
+        <w:rPr>
+          <w:rtl w:val="0"/>
+        </w:rPr>
+      </w:r>
+    </w:p>
+    <w:p>
+      <w:pPr>
+        <w:rPr>
+          <w:b w:val="1"/>
+          <w:bCs w:val="1"/>
+          <w:u w:val="single"/>
+        </w:rPr>
+      </w:pPr>
+      <w:r>
+        <w:rPr>
+          <w:b w:val="1"/>
+          <w:bCs w:val="1"/>
+          <w:u w:val="single"/>
+          <w:rtl w:val="0"/>
+        </w:rPr>
+        <w:t xml:space="preserve">Upside down Window wiper</w:t>
+      </w:r>
+    </w:p>
+    <w:p>
+      <w:pPr>
+        <w:rPr>
+          <w:b w:val="1"/>
+          <w:bCs w:val="1"/>
+        </w:rPr>
+      </w:pPr>
+      <w:r>
+        <w:rPr>
+          <w:rtl w:val="0"/>
+        </w:rPr>
+      </w:r>
+    </w:p>
+    <w:p>
+      <w:pPr>
+        <w:rPr>
+          <w:b w:val="1"/>
+          <w:bCs w:val="1"/>
+        </w:rPr>
+      </w:pPr>
+      <w:r>
+        <w:rPr>
+          <w:b w:val="1"/>
+          <w:bCs w:val="1"/>
+          <w:rtl w:val="0"/>
+        </w:rPr>
+        <w:t xml:space="preserve">The common terminals act like a pendulum and swing back and forth as the end user presses the gang switch. Remember there are four possible states for the light switch. Two of those switches will mean that the light bulb will be on.</w:t>
+      </w:r>
+    </w:p>
+    <w:p>
+      <w:pPr>
+        <w:rPr>
+          <w:b w:val="1"/>
+          <w:bCs w:val="1"/>
+        </w:rPr>
+      </w:pPr>
+      <w:r>
+        <w:rPr>
+          <w:rtl w:val="0"/>
+        </w:rPr>
+      </w:r>
+    </w:p>
+    <w:p>
+      <w:pPr>
+        <w:rPr>
+          <w:b w:val="1"/>
+          <w:bCs w:val="1"/>
+        </w:rPr>
+      </w:pPr>
+      <w:r>
+        <w:rPr>
+          <w:b w:val="1"/>
+          <w:bCs w:val="1"/>
+        </w:rPr>
+        <w:drawing>
+          <wp:inline distB="114300" distT="114300" distL="114300" distR="114300">
+            <wp:extent cx="7037854" cy="2633663"/>
+            <wp:effectExtent b="25400" l="25400" r="25400" t="25400"/>
+            <wp:docPr id="1" name="image1.png"/>
+            <a:graphic>
+              <a:graphicData uri="http://schemas.openxmlformats.org/drawingml/2006/picture">
+                <pic:pic>
+                  <pic:nvPicPr>
+                    <pic:cNvPr id="0" name="image1.png"/>
+                    <pic:cNvPicPr preferRelativeResize="0"/>
+                  </pic:nvPicPr>
+                  <pic:blipFill>
+                    <a:blip r:embed="rId8"/>
+                    <a:srcRect b="0" l="0" r="0" t="0"/>
+                    <a:stretch>
+                      <a:fillRect/>
+                    </a:stretch>
+                  </pic:blipFill>
+                  <pic:spPr>
+                    <a:xfrm>
+                      <a:off x="0" y="0"/>
+                      <a:ext cx="7037854" cy="2633663"/>
+                    </a:xfrm>
+                    <a:prstGeom prst="rect"/>
+                    <a:ln w="25400">
+                      <a:solidFill>
+                        <a:srgbClr val="FF00FF"/>
+                      </a:solidFill>
+                      <a:prstDash val="dash"/>
+                    </a:ln>
+                  </pic:spPr>
+                </pic:pic>
+              </a:graphicData>
+            </a:graphic>
+          </wp:inline>
+        </w:drawing>
+      </w:r>
+      <w:r>
+        <w:rPr>
+          <w:rtl w:val="0"/>
+        </w:rPr>
+      </w:r>
+    </w:p>
+    <w:p>
+      <w:pPr>
+        <w:rPr>
+          <w:b w:val="1"/>
+          <w:bCs w:val="1"/>
+          <w:u w:val="single"/>
+        </w:rPr>
+      </w:pPr>
+      <w:r>
+        <w:rPr>
+          <w:rtl w:val="0"/>
+        </w:rPr>
+      </w:r>
+    </w:p>
+    <w:p>
+      <w:pPr>
+        <w:rPr>
+          <w:b w:val="1"/>
+          <w:bCs w:val="1"/>
+        </w:rPr>
+      </w:pPr>
+      <w:r>
+        <w:rPr>
+          <w:b w:val="1"/>
+          <w:bCs w:val="1"/>
+          <w:rtl w:val="0"/>
+        </w:rPr>
+        <w:t xml:space="preserve">The way that the two states are resemble an upside window wiper featured on a car. </w:t>
       </w:r>
     </w:p>
     <w:sectPr>
-      <w:headerReference r:id="rId8" w:type="default"/>
+      <w:headerReference r:id="rId9" w:type="default"/>
       <w:pgSz w:h="11909" w:w="16834" w:orient="landscape"/>
-      <w:pgMar w:bottom="1440" w:top="1440" w:left="1440" w:right="1440" w:header="720" w:footer="720"/>
+      <w:pgMar w:bottom="1440.0000000000002" w:top="1440.0000000000002" w:left="1440.0000000000002" w:right="1440.0000000000002" w:header="720" w:footer="720"/>
       <w:pgNumType w:start="1"/>
     </w:sectPr>
   </w:body>

</xml_diff>